<commit_message>
Konum paketi: Wi-Fi parmak izi, GPS, BLE, ArUco, gorsel yer ogrenme, odometri, elle bolge + birlestirici; bolgeye gore tarif ve yonlu isaret; ESP32 odo telemetrisi, odo_sifirla, IMU iskeleti, jest yon; TUBITAK docx'e konumlandirma (27 Ekim 2026)
Co-Authored-By: Claude Fable 5.1 <noreply@anthropic.com>
</commit_message>
<xml_diff>
--- a/belgeler/tubitak-2209-b/TUBITAK-2209-B-taslak.docx
+++ b/belgeler/tubitak-2209-b/TUBITAK-2209-B-taslak.docx
@@ -52,7 +52,7 @@
         <w:spacing w:after="120"/>
       </w:pPr>
       <w:r>
-        <w:t xml:space="preserve">Üniversiteler ve sanayi tesisleri ziyaretçi karşılama, tanıtım ve yönlendirme için giderek daha fazla sosyal robot kullanmaktadır; ancak saha çalışmaları bu robotların en zayıf halkasının gürültülü ortamlarda sesli etkileşim olduğunu göstermektedir (Kanda vd., 2010; Tonkin vd., 2018). Bu projede, ders kapsamında tasarlanıp üretilen bacaksız, tekerlekli, iki kollu ve yüz ekranlı insansı robot platformu, asıl görevi olan üniversite tanıtım robotu işlevini korurken, bir sanayi tesisinde ziyaretçi ve personel için bilgilendirme ve yönlendirme asistanı olarak da güvenilir biçimde çalışacak şekilde gürültülü ortamlara uyarlanacaktır. Robot platformunun mekanik tasarımı ders kapsamında sürdürülmektedir; yaklaşık 170 cm boy için devrilme, tahrik ve kol dinamiği hesapları, baskı parçalarının mukavemet artırımı ve servo seçimi güncel tasarıma göre tamamlanacak, platformun kurulumu üniversite ve sanayi kuruluşunun desteğiyle proje başlamadan önce bitirilecektir. Proje üç araştırma sorusunu ele alır: (1) 70-85 dB ortam gürültüsünde mikrofon dizisi, gürültü bastırma ve düğmesiz konuşma etkinliği algılama (VAD) ile komut ve soru tanıma oranının ne ölçüde yükseltilebileceği; (2) kurum bilgisinin (üniversite ↔ tesis) teknik bilgi gerektirmeden değiştirilebilen bir içerik paketi olarak dil modeli destekli diyaloğa nasıl bağlanacağı; (3) insan yakınında çalışan mobil bir sosyal robot için hız, durma ve acil durdurma davranışının hangi ölçütlerle doğrulanacağı. Yöntem, üç ortamda gürültü profili ölçümü, iki mikrofon düzeninin karşılaştırmalı testi, 50 soruluk bilgi tabanı test seti, güvenlik kontrol listesi ve iki saha denemesi (kampüs etkinliği ve sanayi tesisi) ile kullanıcı anketinden oluşur. Başarı ölçütleri niceldir: 75 dB'de komut tanıma oranı en az %85, uçtan uca yanıt gecikmesi en çok 2,5 s, bilgi tabanı sorularında doğruluk en az %80, 0,5 m engelde durma 20/20, her sahada en az 2 saat kesintisiz çalışma ve en az 30 kullanıcı. Proje 12 ay sürecek, dört öğrenci eşit katkıyla altı iş paketini yürütecek; akademik danışman ve sanayi danışmanı izleyecektir. Çıktılar sanayi tesisinde denenmiş bir prototip, gürültü-tanıma-gecikme karşılaştırma tablosu, değiştirilebilir içerik paketi biçimi, güvenlik kontrol listesi ve açık kaynak depo olacak; aynı düşük maliyetli platform KOBİ'lerde bilgilendirme asistanı, fuarlarda ve eğitim kurumlarında tanıtım robotu olarak yaygınlaşabilecektir.</w:t>
+        <w:t>Üniversiteler ve sanayi tesisleri ziyaretçi karşılama, tanıtım ve yönlendirme için giderek daha fazla sosyal robot kullanmaktadır; ancak saha çalışmaları bu robotların en zayıf halkasının gürültülü ortamlarda sesli etkileşim olduğunu göstermektedir (Kanda vd., 2010; Tonkin vd., 2018). Bu projede, ders kapsamında tasarlanıp üretilen bacaksız, tekerlekli, iki kollu ve yüz ekranlı insansı robot platformu, asıl görevi olan üniversite tanıtım robotu işlevini korurken, bir sanayi tesisinde ziyaretçi ve personel için bilgilendirme ve yönlendirme asistanı olarak da güvenilir biçimde çalışacak şekilde gürültülü ortamlara uyarlanacaktır. Robot platformunun mekanik tasarımı ders kapsamında sürdürülmektedir; yaklaşık 170 cm boy için devrilme, tahrik ve kol dinamiği hesapları, baskı parçalarının mukavemet artırımı ve servo seçimi güncel tasarıma göre tamamlanacak, platformun kurulumu üniversite ve sanayi kuruluşunun desteğiyle proje başlamadan önce bitirilecektir. Proje dört araştırma sorusunu ele alır: (1) 70-85 dB ortam gürültüsünde mikrofon dizisi, gürültü bastırma ve düğmesiz konuşma etkinliği algılama (VAD) ile komut ve soru tanıma oranının ne ölçüde yükseltilebileceği; (2) kurum bilgisinin (üniversite ↔ tesis) teknik bilgi gerektirmeden değiştirilebilen bir içerik paketi olarak dil modeli destekli diyaloğa nasıl bağlanacağı; (3) insan yakınında çalışan mobil bir sosyal robot için hız, durma ve acil durdurma davranışının hangi ölçütlerle doğrulanacağı; (4) robotun bulunduğu bölgeyi altyapı kurmadan, düşük maliyetli kaynakları (Wi-Fi parmak izi, GPS, görsel işaretler, teker odometrisi ve kamerayla öğrenilen yer tanıma) birleştirerek ne doğrulukla belirleyebileceği ve yön tarifini buna göre verebileceği. Yöntem, dört ortamda (laboratuvar, kampüs iç mekânı ve açık alanı, sanayi tesisi) gürültü profili ölçümü, iki mikrofon düzeninin karşılaştırmalı testi, 50 soruluk bilgi tabanı test seti, 10 bölgelik konum test turu, güvenlik kontrol listesi ve iki saha denemesi (kampüs etkinliği ve sanayi tesisi) ile kullanıcı anketinden oluşur. Başarı ölçütleri niceldir: 75 dB'de komut tanıma oranı en az %85, uçtan uca yanıt gecikmesi en çok 2,5 s, bilgi tabanı sorularında doğruluk en az %80, bölge tespiti doğruluğu en az %90, 0,5 m engelde durma 20/20, her sahada en az 2 saat kesintisiz çalışma ve en az 30 kullanıcı. Proje 12 ay sürecek, dört öğrenci eşit katkıyla altı iş paketini yürütecek; akademik danışman ve sanayi danışmanı izleyecektir. Çıktılar sanayi tesisinde denenmiş bir prototip, gürültü-tanıma-gecikme karşılaştırma tablosu, değiştirilebilir içerik paketi biçimi, çok kaynaklı konumlandırma modülü, güvenlik kontrol listesi ve açık kaynak depo olacak; aynı düşük maliyetli platform KOBİ'lerde bilgilendirme asistanı, fuarlarda ve eğitim kurumlarında tanıtım robotu olarak yaygınlaşabilecektir.</w:t>
       </w:r>
     </w:p>
     <w:p>
@@ -85,7 +85,7 @@
         <w:spacing w:after="120"/>
       </w:pPr>
       <w:r>
-        <w:t xml:space="preserve">Somut hedefler: (H1) üç ortamın (laboratuvar, kampüs, sanayi tesisi) gürültü profilini ölçmek ve mevcut robotun temel tanıma oranını belirlemek; (H2) mikrofon dizisi + gürültü bastırma + düğmesiz konuşma etkinliği algılama ile 75 dB ortamda komut tanıma oranını en az %85'e, yanıt gecikmesini en çok 2,5 s'ye getirmek; (H3) kurum bilgisini dosya tabanlı, değiştirilebilir bir içerik paketi olarak dil modeli destekli diyaloğa bağlamak ve 50 soruluk test setinde en az %80 doğruluk elde etmek; (H4) insan yakınında güvenli davranış için hız/ivme sınırı, engelde durma ve acil durdurma testlerini ISO 13482 çerçevesinde doğrulamak; (H5) kampüs etkinliğinde ve sanayi tesisinde en az 2'şer saatlik saha denemesi yapıp en az 30 kullanıcıyla kabul ölçümü almak; (H6) sonuçları açık kaynak depo ve teknik notla paylaşmak.</w:t>
+        <w:t>Somut hedefler: (H1) dört ortamın (laboratuvar, kampüs iç mekânı, kampüs açık alanı, sanayi tesisi) gürültü profilini ölçmek ve mevcut robotun temel tanıma oranını belirlemek; (H2) mikrofon dizisi + gürültü bastırma + düğmesiz konuşma etkinliği algılama ile 75 dB ortamda komut tanıma oranını en az %85'e, yanıt gecikmesini en çok 2,5 s'ye getirmek; (H3) kurum bilgisini dosya tabanlı, değiştirilebilir bir içerik paketi olarak dil modeli destekli diyaloğa bağlamak ve 50 soruluk test setinde en az %80 doğruluk elde etmek; (H4) robotun bölgesini Wi-Fi parmak izi, GPS, görsel işaret, teker odometrisi ve kamerayla öğrenilen yer tanıma kaynaklarını birleştirerek iç ve açık alanda en az %90 doğrulukla belirlemek ve yön tarifini bulunduğu bölgeye göre vermek; (H5) insan yakınında güvenli davranış için hız/ivme sınırı, engelde durma ve acil durdurma testlerini ISO 13482 çerçevesinde doğrulamak; (H6) kampüs etkinliğinde ve sanayi tesisinde en az 2'şer saatlik saha denemesi yapıp en az 30 kullanıcıyla kabul ölçümü almak; (H7) sonuçları açık kaynak depo ve teknik notla paylaşmak.</w:t>
       </w:r>
     </w:p>
     <w:p>
@@ -127,6 +127,14 @@
       </w:pPr>
       <w:r>
         <w:t xml:space="preserve">Dördüncü fark, kamusal alanda çalışan mobil sosyal robotlar için mevcut standardın eksik kaldığı gösterilen (Salvini vd., 2021) güvenlik gereksinimlerinin, devrilme kararlılığı ölçütüyle (Papadopoulos ve Rey, 1996) birlikte uygulanabilir bir kontrol listesine dönüştürülmesidir.</w:t>
+      </w:r>
+    </w:p>
+    <w:p>
+      <w:pPr>
+        <w:spacing w:after="120"/>
+      </w:pPr>
+      <w:r>
+        <w:t>Beşinci fark, robotun bulunduğu yeri bilmesinin pahalı iç mekân konumlandırma altyapısı (UWB çapaları, lidar haritası) kurmadan, zaten var olan kablosuz ağ, ucuz GPS, basılı işaretler, teker odometrisi ve robota sahada öğretilen yer görünümlerinin birleştirilmesiyle çözülmesidir; aynı yazılım hem kampüs binasında hem tesis girişinde çalışır ve bölge bilgisi yön tarifini kişiye göre doğru yöne çevirir. Kaynakların tek tek ve birleşik doğruluğu aynı test turunda raporlanacaktır.</w:t>
       </w:r>
     </w:p>
     <w:p>
@@ -181,7 +189,7 @@
         <w:t xml:space="preserve">İP1 Temel ölçüm ve gereksinim (Ay 1-2).</w:t>
       </w:r>
       <w:r>
-        <w:t xml:space="preserve"> Üç ortamda (laboratuvar, kampüs tanıtım alanı, sanayi tesisi girişi) A-ağırlıklı ses seviyesi ölçerle gürültü düzeyi ve spektrumu kaydedilir. Mevcut tek mikrofonlu düzenle 100 komut/sorudan oluşan Türkçe test seti sessiz ortamda ve kayıtlı gürültü altında çalıştırılır; komut tanıma oranı, kelime hata oranı ve uçtan uca gecikme temel değer olarak raporlanır. Sanayi danışmanıyla tesis gereksinimleri (ziyaretçi akışı, soru türleri, güvenlik kuralları) listelenir.</w:t>
+        <w:t xml:space="preserve"> Dört ortamda (laboratuvar, kampüs iç mekânı, kampüs açık alanı, sanayi tesisi girişi) A-ağırlıklı ses seviyesi ölçerle gürültü düzeyi ve spektrumu kaydedilir; açık alanda rüzgâr koşulu da not edilir. Mevcut tek mikrofonlu düzenle 100 komut/sorudan oluşan Türkçe test seti sessiz ortamda ve kayıtlı gürültü altında çalıştırılır; komut tanıma oranı, kelime hata oranı ve uçtan uca gecikme temel değer olarak raporlanır. Sanayi danışmanıyla tesis gereksinimleri (ziyaretçi akışı, soru türleri, güvenlik kuralları) listelenir.</w:t>
       </w:r>
     </w:p>
     <w:p>
@@ -196,7 +204,7 @@
         <w:t xml:space="preserve">İP2 Gürültüye dayanıklı ses alt sistemi (Ay 2-5).</w:t>
       </w:r>
       <w:r>
-        <w:t xml:space="preserve"> İki düzen karşılaştırılır: (a) dört mikrofonlu dizi + açık kaynak ses kaynağı konumlandırma/ayırma (Grondin vd., 2022), (b) yönlü mikrofon. Her ikisinde gürültü bastırma ve düğmesiz konuşma etkinliği algılama (VAD) kullanılır; etkileşim tamamen seslidir, düğme ya da ekran girişi yoktur; robotun kendi motor gürültüsü hareket halinde ayrıca ölçülür (İnce vd., 2009). Konuşma tanıma bulutta çalışır; bağlantı kesilirse yerel küçük modelle sınırlı komut seti devreye girer (Cao, 2025). Ölçüm: 65/75/85 dB'de komut tanıma oranı ve gecikme, her koşulda 100 deneme, en az 5 konuşmacı. Hedef 75 dB'de ≥ %85 ve ≤ 2,5 s.</w:t>
+        <w:t xml:space="preserve"> İki düzen karşılaştırılır: (a) donanımsal yankı iptali ve gürültü bastırmalı dört mikrofonlu dizi (ham ve işlenmiş kanallar birlikte kaydedilir; ham kanallarda açık kaynak ses kaynağı konumlandırma/ayırma, Grondin vd., 2022), (b) rüzgâr kılıflı yönlü mikrofon. Mikrofon dizisi robot kafasının içine, durgun hava hacmine gömülü ve köpük/kürk kılıflı monte edilir; yüksek geçiren filtreyle rüzgâr gürültüsü azaltılır. Her ikisinde gürültü bastırma ve düğmesiz konuşma etkinliği algılama (VAD) kullanılır; etkileşim tamamen seslidir, düğme ya da ekran girişi yoktur; robotun kendi motor gürültüsü hareket halinde ayrıca ölçülür (İnce vd., 2009). Konuşma tanıma bulutta çalışır; bağlantı kesilirse yerel küçük modelle sınırlı komut seti devreye girer (Cao, 2025). Ölçüm: 65/75/85 dB'de komut tanıma oranı ve gecikme, her koşulda 100 deneme, en az 5 konuşmacı. Hedef 75 dB'de ≥ %85 ve ≤ 2,5 s.</w:t>
       </w:r>
     </w:p>
     <w:p>
@@ -208,10 +216,10 @@
           <w:b/>
           <w:bCs/>
         </w:rPr>
-        <w:t xml:space="preserve">İP3 Değiştirilebilir içerik paketi (Ay 4-7).</w:t>
-      </w:r>
-      <w:r>
-        <w:t xml:space="preserve"> Kurum bilgisi (bölümler, kişiler, yerler, ürünler, sık sorulanlar) yapılandırılmış dosya paketi olarak tanımlanır; dil modeli bu paketten bilgi getirerek (RAG) yanıt üretir (Cherakara vd., 2023; Mauliana vd., 2025). Üniversite ve tesis için iki örnek paket hazırlanır. Ölçüm: paket başına 50 soruluk test setinde doğru yanıt oranı (hedef ≥ %80), yanlış bilgi (halüsinasyon) oranı, paket değiştirme süresi (hedef ≤ 30 dk, teknik bilgi gerektirmeden). Yanıtlar kayıtlı jest ve yüz ifadesiyle eşlenir (Kim vd., 2024).</w:t>
+        <w:t>İP3 Değiştirilebilir içerik paketi ve konuma duyarlı yönlendirme (Ay 4-8).</w:t>
+      </w:r>
+      <w:r>
+        <w:t xml:space="preserve"> Kurum bilgisi (bölümler, kişiler, yerler, ürünler, sık sorulanlar) yapılandırılmış dosya paketi olarak tanımlanır; dil modeli bu paketten bilgi getirerek (RAG) yanıt üretir (Cherakara vd., 2023; Mauliana vd., 2025). Üniversite ve tesis için iki örnek paket hazırlanır. Ölçüm: paket başına 50 soruluk test setinde doğru yanıt oranı (hedef ≥ %80), yanlış bilgi (halüsinasyon) oranı, paket değiştirme süresi (hedef ≤ 30 dk, teknik bilgi gerektirmeden). Yanıtlar kayıtlı jest ve yüz ifadesiyle eşlenir (Kim vd., 2024). Yer sorularında robot, bulunduğu bölgeye göre tarif verir ve kolunu o yöne kaldırır; bölge, altyapı kurulumu gerektirmeyen düşük maliyetli kaynakların birleştirilmesiyle belirlenir: mevcut kablosuz ağ erişim noktalarının sinyal parmak izi (bağlantı gerektirmez), açık alanda GPS, kameradan okunan basılı görsel işaretler (ArUco), teker enkoderi ve atalet sensörüyle ölü hesap ve robota sahada öğretilen yer görünümleri (kameradan çıkarılan sayısal özetlerin en yakın komşu eşlemesi; görüntü saklanmaz). Her kaynak güven ağırlığıyla birleştirilir; hiçbir kaynak taze değilse son bilinen bölge korunur, böylece ağ ya da sensör kesintisi yönlendirmeyi durdurmaz. Ölçüm: kampüs iç mekânı, açık alanı ve tesis girişinde 10 bölgelik test turunda doğru bölge oranı (hedef ≥ %90), kaynak başına ve birleşik; yön tarifi doğruluğu kullanıcı değerlendirmesiyle.</w:t>
       </w:r>
     </w:p>
     <w:p>
@@ -271,7 +279,7 @@
         <w:t xml:space="preserve">Veri ve etik.</w:t>
       </w:r>
       <w:r>
-        <w:t xml:space="preserve"> Ses ve görüntü anlık işlenir, kaydedilmez; anket anonimdir; gerekli etik kurul/kurum izinleri İP1'de alınır.</w:t>
+        <w:t xml:space="preserve"> Ses ve görüntü anlık işlenir, kaydedilmez; yer tanıma için yalnız görüntüden türetilen sayısal özetler saklanır, görüntünün kendisi ve kişiler saklanmaz; anket anonimdir; gerekli etik kurul/kurum izinleri İP1'de alınır.</w:t>
       </w:r>
     </w:p>
     <w:p>
@@ -510,7 +518,7 @@
                 <w:sz w:val="18"/>
                 <w:szCs w:val="18"/>
               </w:rPr>
-              <w:t xml:space="preserve">3 ortam × gürültü profili; ≥100 komutluk temel tanıma oranı ve gecikme raporu</w:t>
+              <w:t xml:space="preserve">4 ortam × gürültü profili; ≥100 komutluk temel tanıma oranı ve gecikme raporu</w:t>
             </w:r>
           </w:p>
         </w:tc>
@@ -674,73 +682,73 @@
                 <w:sz w:val="18"/>
                 <w:szCs w:val="18"/>
               </w:rPr>
-              <w:t xml:space="preserve">İP3 Değiştirilebilir içerik paketi</w:t>
-            </w:r>
-          </w:p>
-        </w:tc>
-        <w:tc>
-          <w:tcPr>
-            <w:tcW w:type="dxa" w:w="1800"/>
-            <w:tcMar>
-              <w:top w:type="dxa" w:w="60"/>
-              <w:left w:type="dxa" w:w="80"/>
-              <w:bottom w:type="dxa" w:w="60"/>
-              <w:right w:type="dxa" w:w="80"/>
-            </w:tcMar>
-          </w:tcPr>
-          <w:p>
-            <w:r>
-              <w:rPr>
-                <w:b w:val="false"/>
-                <w:bCs w:val="false"/>
-                <w:sz w:val="18"/>
-                <w:szCs w:val="18"/>
-              </w:rPr>
-              <w:t xml:space="preserve">4-7</w:t>
-            </w:r>
-          </w:p>
-        </w:tc>
-        <w:tc>
-          <w:tcPr>
-            <w:tcW w:type="dxa" w:w="1800"/>
-            <w:tcMar>
-              <w:top w:type="dxa" w:w="60"/>
-              <w:left w:type="dxa" w:w="80"/>
-              <w:bottom w:type="dxa" w:w="60"/>
-              <w:right w:type="dxa" w:w="80"/>
-            </w:tcMar>
-          </w:tcPr>
-          <w:p>
-            <w:r>
-              <w:rPr>
-                <w:b w:val="false"/>
-                <w:bCs w:val="false"/>
-                <w:sz w:val="18"/>
-                <w:szCs w:val="18"/>
-              </w:rPr>
-              <w:t xml:space="preserve">Kurum bilgi tabanı (üniversite / tesis) dosya paketi; dil modeli + bilgi tabanından cevap; çevrimdışı yedek komut seti</w:t>
-            </w:r>
-          </w:p>
-        </w:tc>
-        <w:tc>
-          <w:tcPr>
-            <w:tcW w:type="dxa" w:w="1800"/>
-            <w:tcMar>
-              <w:top w:type="dxa" w:w="60"/>
-              <w:left w:type="dxa" w:w="80"/>
-              <w:bottom w:type="dxa" w:w="60"/>
-              <w:right w:type="dxa" w:w="80"/>
-            </w:tcMar>
-          </w:tcPr>
-          <w:p>
-            <w:r>
-              <w:rPr>
-                <w:b w:val="false"/>
-                <w:bCs w:val="false"/>
-                <w:sz w:val="18"/>
-                <w:szCs w:val="18"/>
-              </w:rPr>
-              <w:t xml:space="preserve">50 soruluk test setinde doğru cevap ≥ %80; içerik değişimi ≤ 30 dk, teknik bilgi gerektirmeden</w:t>
+              <w:t>İP3 Değiştirilebilir içerik paketi ve konuma duyarlı yönlendirme</w:t>
+            </w:r>
+          </w:p>
+        </w:tc>
+        <w:tc>
+          <w:tcPr>
+            <w:tcW w:type="dxa" w:w="1800"/>
+            <w:tcMar>
+              <w:top w:type="dxa" w:w="60"/>
+              <w:left w:type="dxa" w:w="80"/>
+              <w:bottom w:type="dxa" w:w="60"/>
+              <w:right w:type="dxa" w:w="80"/>
+            </w:tcMar>
+          </w:tcPr>
+          <w:p>
+            <w:r>
+              <w:rPr>
+                <w:b w:val="false"/>
+                <w:bCs w:val="false"/>
+                <w:sz w:val="18"/>
+                <w:szCs w:val="18"/>
+              </w:rPr>
+              <w:t>4-8</w:t>
+            </w:r>
+          </w:p>
+        </w:tc>
+        <w:tc>
+          <w:tcPr>
+            <w:tcW w:type="dxa" w:w="1800"/>
+            <w:tcMar>
+              <w:top w:type="dxa" w:w="60"/>
+              <w:left w:type="dxa" w:w="80"/>
+              <w:bottom w:type="dxa" w:w="60"/>
+              <w:right w:type="dxa" w:w="80"/>
+            </w:tcMar>
+          </w:tcPr>
+          <w:p>
+            <w:r>
+              <w:rPr>
+                <w:b w:val="false"/>
+                <w:bCs w:val="false"/>
+                <w:sz w:val="18"/>
+                <w:szCs w:val="18"/>
+              </w:rPr>
+              <w:t>Kurum bilgi tabanı (üniversite / tesis) dosya paketi; dil modeli + bilgi tabanından cevap; çevrimdışı yedek komut seti; bölge tespiti (Wi-Fi parmak izi + GPS + görsel işaret + odometri + kamerayla öğrenilen yer tanıma) ve bölgeye göre yön tarifi</w:t>
+            </w:r>
+          </w:p>
+        </w:tc>
+        <w:tc>
+          <w:tcPr>
+            <w:tcW w:type="dxa" w:w="1800"/>
+            <w:tcMar>
+              <w:top w:type="dxa" w:w="60"/>
+              <w:left w:type="dxa" w:w="80"/>
+              <w:bottom w:type="dxa" w:w="60"/>
+              <w:right w:type="dxa" w:w="80"/>
+            </w:tcMar>
+          </w:tcPr>
+          <w:p>
+            <w:r>
+              <w:rPr>
+                <w:b w:val="false"/>
+                <w:bCs w:val="false"/>
+                <w:sz w:val="18"/>
+                <w:szCs w:val="18"/>
+              </w:rPr>
+              <w:t>50 soruluk test setinde doğru cevap ≥ %80; içerik değişimi ≤ 30 dk, teknik bilgi gerektirmeden; 10 bölgelik test turunda doğru bölge ≥ %90</w:t>
             </w:r>
           </w:p>
         </w:tc>
@@ -1510,6 +1518,104 @@
                 <w:sz w:val="18"/>
                 <w:szCs w:val="18"/>
               </w:rPr>
+              <w:t xml:space="preserve">Açık alanda rüzgâr gürültüsü</w:t>
+            </w:r>
+          </w:p>
+        </w:tc>
+        <w:tc>
+          <w:tcPr>
+            <w:tcW w:type="dxa" w:w="4500"/>
+            <w:tcMar>
+              <w:top w:type="dxa" w:w="60"/>
+              <w:left w:type="dxa" w:w="80"/>
+              <w:bottom w:type="dxa" w:w="60"/>
+              <w:right w:type="dxa" w:w="80"/>
+            </w:tcMar>
+          </w:tcPr>
+          <w:p>
+            <w:r>
+              <w:rPr>
+                <w:b w:val="false"/>
+                <w:bCs w:val="false"/>
+                <w:sz w:val="18"/>
+                <w:szCs w:val="18"/>
+              </w:rPr>
+              <w:t xml:space="preserve">Mikrofon dizisi kafa içine gömülü, köpük/kürk kılıflı; yüksek geçiren filtre; rüzgâr koşulu kaydedilir, kuvvetli rüzgârda açık alan denemesi ertelenir</w:t>
+            </w:r>
+          </w:p>
+        </w:tc>
+      </w:tr>
+      <w:tr>
+        <w:trPr>
+          <w:tblHeader w:val="false"/>
+        </w:trPr>
+        <w:tc>
+          <w:tcPr>
+            <w:tcW w:type="dxa" w:w="4500"/>
+            <w:tcMar>
+              <w:top w:type="dxa" w:w="60"/>
+              <w:left w:type="dxa" w:w="80"/>
+              <w:bottom w:type="dxa" w:w="60"/>
+              <w:right w:type="dxa" w:w="80"/>
+            </w:tcMar>
+          </w:tcPr>
+          <w:p>
+            <w:r>
+              <w:rPr>
+                <w:b w:val="false"/>
+                <w:bCs w:val="false"/>
+                <w:sz w:val="18"/>
+                <w:szCs w:val="18"/>
+              </w:rPr>
+              <w:t>Bölge tespiti açık alanda ya da kalabalıkta düşer</w:t>
+            </w:r>
+          </w:p>
+        </w:tc>
+        <w:tc>
+          <w:tcPr>
+            <w:tcW w:type="dxa" w:w="4500"/>
+            <w:tcMar>
+              <w:top w:type="dxa" w:w="60"/>
+              <w:left w:type="dxa" w:w="80"/>
+              <w:bottom w:type="dxa" w:w="60"/>
+              <w:right w:type="dxa" w:w="80"/>
+            </w:tcMar>
+          </w:tcPr>
+          <w:p>
+            <w:r>
+              <w:rPr>
+                <w:b w:val="false"/>
+                <w:bCs w:val="false"/>
+                <w:sz w:val="18"/>
+                <w:szCs w:val="18"/>
+              </w:rPr>
+              <w:t>Kaynaklar birbirini yedekler (içeride Wi-Fi + işaret, dışarıda GPS); son bilinen bölge korunur; elle bölge seçimi; bölge bilinmiyorsa genel tarif ve görevliye yönlendirme</w:t>
+            </w:r>
+          </w:p>
+        </w:tc>
+      </w:tr>
+      <w:tr>
+        <w:trPr>
+          <w:tblHeader w:val="false"/>
+        </w:trPr>
+        <w:tc>
+          <w:tcPr>
+            <w:tcW w:type="dxa" w:w="4500"/>
+            <w:tcMar>
+              <w:top w:type="dxa" w:w="60"/>
+              <w:left w:type="dxa" w:w="80"/>
+              <w:bottom w:type="dxa" w:w="60"/>
+              <w:right w:type="dxa" w:w="80"/>
+            </w:tcMar>
+          </w:tcPr>
+          <w:p>
+            <w:r>
+              <w:rPr>
+                <w:b w:val="false"/>
+                <w:bCs w:val="false"/>
+                <w:sz w:val="18"/>
+                <w:szCs w:val="18"/>
+              </w:rPr>
               <w:t xml:space="preserve">Kişisel veri (ses, görüntü)</w:t>
             </w:r>
           </w:p>
@@ -1609,7 +1715,7 @@
         <w:t xml:space="preserve">Platform bileşenleri:</w:t>
       </w:r>
       <w:r>
-        <w:t xml:space="preserve"> Ana işlemci (8 GB tek kartlı bilgisayar), 10,1 inç dokunmatik ekran, tahrik, servo, akü ve gövde malzemesi dahil tüm platform bileşenleri, üniversite ve sanayi ortağının desteğiyle proje başlamadan önce temin edilecektir. Robotun mekanik tasarımı parametrik CAD ortamında sürmekte olup malzeme listesi güncel tasarım revizyonuyla birlikte kesinleşecektir. TÜBİTAK bütçesi yalnız ses alt sistemi, ölçüm cihazları, bulut hizmeti, sarf malzemesi ve saha ulaşımı için kullanılacaktır.</w:t>
+        <w:t xml:space="preserve"> Ana işlemci (8 GB tek kartlı bilgisayar), 10,1 inç dokunmatik ekran, tahrik, servo, akü ve gövde malzemesi dahil tüm platform bileşenleri, üniversite ve sanayi ortağının desteğiyle proje başlamadan önce temin edilecektir. Robotun mekanik tasarımı parametrik CAD ortamında sürmekte olup malzeme listesi güncel tasarım revizyonuyla birlikte kesinleşecektir. Konumlandırma için kullanılan kamera ve teker enkoderleri platformun parçasıdır; GPS modülü, görsel işaret levhaları ve gerekirse birkaç Bluetooth işaretçi (ESP32) üniversite ve sanayi ortağının desteğiyle temin edilecektir. TÜBİTAK bütçesi yalnız ses alt sistemi, ölçüm cihazları, bulut hizmeti, sarf malzemesi ve saha ulaşımı için kullanılacaktır.</w:t>
       </w:r>
     </w:p>
     <w:p>
@@ -1644,7 +1750,7 @@
         <w:spacing w:after="80"/>
       </w:pPr>
       <w:r>
-        <w:t xml:space="preserve">Ortam gürültüsü × tanıma oranı × gecikme karşılaştırma tablosu (3 ortam, 2 mikrofon düzeni).</w:t>
+        <w:t xml:space="preserve">Ortam gürültüsü × tanıma oranı × gecikme karşılaştırma tablosu (4 ortam, 2 mikrofon düzeni).</w:t>
       </w:r>
     </w:p>
     <w:p>
@@ -1671,6 +1777,19 @@
       </w:pPr>
       <w:r>
         <w:t xml:space="preserve">Sanayi ortamı güvenlik kontrol listesi ve test sonuçları.</w:t>
+      </w:r>
+    </w:p>
+    <w:p>
+      <w:pPr>
+        <w:pStyle w:val="ListParagraph"/>
+        <w:numPr>
+          <w:ilvl w:val="0"/>
+          <w:numId w:val="3"/>
+        </w:numPr>
+        <w:spacing w:after="80"/>
+      </w:pPr>
+      <w:r>
+        <w:t>Çok kaynaklı konumlandırma modülü (Wi-Fi parmak izi, GPS, görsel işaret, odometri, öğrenilen yer tanıma) ve kaynak başına / birleşik bölge doğruluğu tablosu.</w:t>
       </w:r>
     </w:p>
     <w:p>
@@ -1824,7 +1943,7 @@
                 <w:sz w:val="18"/>
                 <w:szCs w:val="18"/>
               </w:rPr>
-              <w:t xml:space="preserve">4 mikrofonlu USB dizi (ör. ReSpeaker sınıfı)</w:t>
+              <w:t xml:space="preserve">Donanımsal yankı iptalli ve gürültü bastırmalı 4 mikrofonlu USB mikrofon dizisi + rüzgâr koruyucu</w:t>
             </w:r>
           </w:p>
         </w:tc>
@@ -1868,7 +1987,7 @@
                 <w:sz w:val="18"/>
                 <w:szCs w:val="18"/>
               </w:rPr>
-              <w:t xml:space="preserve">3.500</w:t>
+              <w:t xml:space="preserve">5.500</w:t>
             </w:r>
           </w:p>
         </w:tc>
@@ -1895,7 +2014,7 @@
                 <w:sz w:val="18"/>
                 <w:szCs w:val="18"/>
               </w:rPr>
-              <w:t xml:space="preserve">Yönlü mikrofon + USB ses kartı (karşılaştırma kolu)</w:t>
+              <w:t xml:space="preserve">Yönlü mikrofon, USB ses kartı ve kürk rüzgâr kılıfı (karşılaştırma kolu)</w:t>
             </w:r>
           </w:p>
         </w:tc>
@@ -1939,7 +2058,7 @@
                 <w:sz w:val="18"/>
                 <w:szCs w:val="18"/>
               </w:rPr>
-              <w:t xml:space="preserve">1.800</w:t>
+              <w:t xml:space="preserve">2.000</w:t>
             </w:r>
           </w:p>
         </w:tc>
@@ -2037,7 +2156,7 @@
                 <w:sz w:val="18"/>
                 <w:szCs w:val="18"/>
               </w:rPr>
-              <w:t xml:space="preserve">Ek mesafe sensörleri (ToF ×3) + kablo</w:t>
+              <w:t xml:space="preserve">Bulut konuşma/dil modeli kredisi (12 ay)</w:t>
             </w:r>
           </w:p>
         </w:tc>
@@ -2059,7 +2178,7 @@
                 <w:sz w:val="18"/>
                 <w:szCs w:val="18"/>
               </w:rPr>
-              <w:t xml:space="preserve">sarf</w:t>
+              <w:t xml:space="preserve">hizmet alımı</w:t>
             </w:r>
           </w:p>
         </w:tc>
@@ -2081,7 +2200,7 @@
                 <w:sz w:val="18"/>
                 <w:szCs w:val="18"/>
               </w:rPr>
-              <w:t xml:space="preserve">1.200</w:t>
+              <w:t xml:space="preserve">3.000</w:t>
             </w:r>
           </w:p>
         </w:tc>
@@ -2108,7 +2227,7 @@
                 <w:sz w:val="18"/>
                 <w:szCs w:val="18"/>
               </w:rPr>
-              <w:t xml:space="preserve">Bulut konuşma/dil modeli kredisi (12 ay)</w:t>
+              <w:t xml:space="preserve">Filament, kablo, konnektör, yedek servo/sürücü</w:t>
             </w:r>
           </w:p>
         </w:tc>
@@ -2130,7 +2249,7 @@
                 <w:sz w:val="18"/>
                 <w:szCs w:val="18"/>
               </w:rPr>
-              <w:t xml:space="preserve">hizmet alımı</w:t>
+              <w:t xml:space="preserve">sarf</w:t>
             </w:r>
           </w:p>
         </w:tc>
@@ -2152,7 +2271,7 @@
                 <w:sz w:val="18"/>
                 <w:szCs w:val="18"/>
               </w:rPr>
-              <w:t xml:space="preserve">3.000</w:t>
+              <w:t xml:space="preserve">2.500</w:t>
             </w:r>
           </w:p>
         </w:tc>
@@ -2179,7 +2298,7 @@
                 <w:sz w:val="18"/>
                 <w:szCs w:val="18"/>
               </w:rPr>
-              <w:t xml:space="preserve">Filament, kablo, konnektör, yedek servo/sürücü</w:t>
+              <w:t xml:space="preserve">Saha günleri ulaşım (sanayi tesisi, kampüs dışı)</w:t>
             </w:r>
           </w:p>
         </w:tc>
@@ -2201,7 +2320,7 @@
                 <w:sz w:val="18"/>
                 <w:szCs w:val="18"/>
               </w:rPr>
-              <w:t xml:space="preserve">sarf</w:t>
+              <w:t xml:space="preserve">seyahat</w:t>
             </w:r>
           </w:p>
         </w:tc>
@@ -2223,7 +2342,7 @@
                 <w:sz w:val="18"/>
                 <w:szCs w:val="18"/>
               </w:rPr>
-              <w:t xml:space="preserve">2.500</w:t>
+              <w:t xml:space="preserve">1.000</w:t>
             </w:r>
           </w:p>
         </w:tc>
@@ -2250,7 +2369,7 @@
                 <w:sz w:val="18"/>
                 <w:szCs w:val="18"/>
               </w:rPr>
-              <w:t xml:space="preserve">Lazer kesim / baskı hizmeti (mikrofon yuvası, kapak)</w:t>
+              <w:t xml:space="preserve">Kırtasiye, poster, bilgilendirme levhası</w:t>
             </w:r>
           </w:p>
         </w:tc>
@@ -2272,7 +2391,7 @@
                 <w:sz w:val="18"/>
                 <w:szCs w:val="18"/>
               </w:rPr>
-              <w:t xml:space="preserve">hizmet alımı</w:t>
+              <w:t xml:space="preserve">kırtasiye</w:t>
             </w:r>
           </w:p>
         </w:tc>
@@ -2294,7 +2413,7 @@
                 <w:sz w:val="18"/>
                 <w:szCs w:val="18"/>
               </w:rPr>
-              <w:t xml:space="preserve">1.000</w:t>
+              <w:t xml:space="preserve">500</w:t>
             </w:r>
           </w:p>
         </w:tc>
@@ -2321,148 +2440,6 @@
                 <w:sz w:val="18"/>
                 <w:szCs w:val="18"/>
               </w:rPr>
-              <w:t xml:space="preserve">Saha günleri ulaşım (sanayi tesisi, kampüs dışı)</w:t>
-            </w:r>
-          </w:p>
-        </w:tc>
-        <w:tc>
-          <w:tcPr>
-            <w:tcW w:type="dxa" w:w="3000"/>
-            <w:tcMar>
-              <w:top w:type="dxa" w:w="60"/>
-              <w:left w:type="dxa" w:w="80"/>
-              <w:bottom w:type="dxa" w:w="60"/>
-              <w:right w:type="dxa" w:w="80"/>
-            </w:tcMar>
-          </w:tcPr>
-          <w:p>
-            <w:r>
-              <w:rPr>
-                <w:b w:val="false"/>
-                <w:bCs w:val="false"/>
-                <w:sz w:val="18"/>
-                <w:szCs w:val="18"/>
-              </w:rPr>
-              <w:t xml:space="preserve">seyahat</w:t>
-            </w:r>
-          </w:p>
-        </w:tc>
-        <w:tc>
-          <w:tcPr>
-            <w:tcW w:type="dxa" w:w="3000"/>
-            <w:tcMar>
-              <w:top w:type="dxa" w:w="60"/>
-              <w:left w:type="dxa" w:w="80"/>
-              <w:bottom w:type="dxa" w:w="60"/>
-              <w:right w:type="dxa" w:w="80"/>
-            </w:tcMar>
-          </w:tcPr>
-          <w:p>
-            <w:r>
-              <w:rPr>
-                <w:b w:val="false"/>
-                <w:bCs w:val="false"/>
-                <w:sz w:val="18"/>
-                <w:szCs w:val="18"/>
-              </w:rPr>
-              <w:t xml:space="preserve">1.000</w:t>
-            </w:r>
-          </w:p>
-        </w:tc>
-      </w:tr>
-      <w:tr>
-        <w:trPr>
-          <w:tblHeader w:val="false"/>
-        </w:trPr>
-        <w:tc>
-          <w:tcPr>
-            <w:tcW w:type="dxa" w:w="3000"/>
-            <w:tcMar>
-              <w:top w:type="dxa" w:w="60"/>
-              <w:left w:type="dxa" w:w="80"/>
-              <w:bottom w:type="dxa" w:w="60"/>
-              <w:right w:type="dxa" w:w="80"/>
-            </w:tcMar>
-          </w:tcPr>
-          <w:p>
-            <w:r>
-              <w:rPr>
-                <w:b w:val="false"/>
-                <w:bCs w:val="false"/>
-                <w:sz w:val="18"/>
-                <w:szCs w:val="18"/>
-              </w:rPr>
-              <w:t xml:space="preserve">Kırtasiye, poster, bilgilendirme levhası</w:t>
-            </w:r>
-          </w:p>
-        </w:tc>
-        <w:tc>
-          <w:tcPr>
-            <w:tcW w:type="dxa" w:w="3000"/>
-            <w:tcMar>
-              <w:top w:type="dxa" w:w="60"/>
-              <w:left w:type="dxa" w:w="80"/>
-              <w:bottom w:type="dxa" w:w="60"/>
-              <w:right w:type="dxa" w:w="80"/>
-            </w:tcMar>
-          </w:tcPr>
-          <w:p>
-            <w:r>
-              <w:rPr>
-                <w:b w:val="false"/>
-                <w:bCs w:val="false"/>
-                <w:sz w:val="18"/>
-                <w:szCs w:val="18"/>
-              </w:rPr>
-              <w:t xml:space="preserve">kırtasiye</w:t>
-            </w:r>
-          </w:p>
-        </w:tc>
-        <w:tc>
-          <w:tcPr>
-            <w:tcW w:type="dxa" w:w="3000"/>
-            <w:tcMar>
-              <w:top w:type="dxa" w:w="60"/>
-              <w:left w:type="dxa" w:w="80"/>
-              <w:bottom w:type="dxa" w:w="60"/>
-              <w:right w:type="dxa" w:w="80"/>
-            </w:tcMar>
-          </w:tcPr>
-          <w:p>
-            <w:r>
-              <w:rPr>
-                <w:b w:val="false"/>
-                <w:bCs w:val="false"/>
-                <w:sz w:val="18"/>
-                <w:szCs w:val="18"/>
-              </w:rPr>
-              <w:t xml:space="preserve">500</w:t>
-            </w:r>
-          </w:p>
-        </w:tc>
-      </w:tr>
-      <w:tr>
-        <w:trPr>
-          <w:tblHeader w:val="false"/>
-        </w:trPr>
-        <w:tc>
-          <w:tcPr>
-            <w:tcW w:type="dxa" w:w="3000"/>
-            <w:tcMar>
-              <w:top w:type="dxa" w:w="60"/>
-              <w:left w:type="dxa" w:w="80"/>
-              <w:bottom w:type="dxa" w:w="60"/>
-              <w:right w:type="dxa" w:w="80"/>
-            </w:tcMar>
-          </w:tcPr>
-          <w:p>
-            <w:r>
-              <w:rPr>
-                <w:b w:val="false"/>
-                <w:bCs w:val="false"/>
-                <w:sz w:val="18"/>
-                <w:szCs w:val="18"/>
-              </w:rPr>
               <w:t xml:space="preserve">Toplam</w:t>
             </w:r>
           </w:p>
@@ -2507,6 +2484,14 @@
       <w:pPr>
         <w:spacing w:after="120"/>
       </w:pPr>
+    </w:p>
+    <w:p>
+      <w:pPr>
+        <w:spacing w:after="120"/>
+      </w:pPr>
+      <w:r>
+        <w:t>Sanayi ortağı ve üniversitenin karşıladığı kalemler (TÜBİTAK bütçesi dışında): robot platformunun tamamı, ek mesafe sensörleri (ToF ×3) ve kablolama (≈ 1.200 TL), lazer kesim / baskı hizmeti (mikrofon yuvası, kapak; ≈ 1.000 TL), konumlandırma için GPS modülü (≈ 600 TL), basılı görsel işaret levhaları (≈ 200 TL) ve gerekirse üç Bluetooth işaretçi (ESP32, ≈ 600 TL). Program desteği üst sınırı 16.000 TL olduğundan bu kalemler forma yazılmamış, 3.3'teki mevcut olanaklar içinde gösterilmiştir.</w:t>
+      </w:r>
     </w:p>
     <w:p>
       <w:pPr>

</xml_diff>